<commit_message>
correccion al insertar ocasionales
</commit_message>
<xml_diff>
--- a/Descripcion/partido-convertido.docx
+++ b/Descripcion/partido-convertido.docx
@@ -1,6 +1,6 @@
 
 <file path=word/document.xml><?xml version="1.0" encoding="utf-8"?>
-<w:document xmlns:wpc="http://schemas.microsoft.com/office/word/2010/wordprocessingCanvas" xmlns:cx="http://schemas.microsoft.com/office/drawing/2014/chartex" xmlns:cx1="http://schemas.microsoft.com/office/drawing/2015/9/8/chartex" xmlns:cx2="http://schemas.microsoft.com/office/drawing/2015/10/21/chartex" xmlns:cx3="http://schemas.microsoft.com/office/drawing/2016/5/9/chartex" xmlns:cx4="http://schemas.microsoft.com/office/drawing/2016/5/10/chartex" xmlns:cx5="http://schemas.microsoft.com/office/drawing/2016/5/11/chartex" xmlns:cx6="http://schemas.microsoft.com/office/drawing/2016/5/12/chartex" xmlns:cx7="http://schemas.microsoft.com/office/drawing/2016/5/13/chartex" xmlns:cx8="http://schemas.microsoft.com/office/drawing/2016/5/14/chartex" xmlns:mc="http://schemas.openxmlformats.org/markup-compatibility/2006" xmlns:aink="http://schemas.microsoft.com/office/drawing/2016/ink" xmlns:am3d="http://schemas.microsoft.com/office/drawing/2017/model3d" xmlns:o="urn:schemas-microsoft-com:office:office" xmlns:r="http://schemas.openxmlformats.org/officeDocument/2006/relationships" xmlns:m="http://schemas.openxmlformats.org/officeDocument/2006/math" xmlns:v="urn:schemas-microsoft-com:vml" xmlns:wp14="http://schemas.microsoft.com/office/word/2010/wordprocessingDrawing" xmlns:wp="http://schemas.openxmlformats.org/drawingml/2006/wordprocessingDrawing" xmlns:w10="urn:schemas-microsoft-com:office:word" xmlns:w="http://schemas.openxmlformats.org/wordprocessingml/2006/main" xmlns:w14="http://schemas.microsoft.com/office/word/2010/wordml" xmlns:w15="http://schemas.microsoft.com/office/word/2012/wordml" xmlns:w16cex="http://schemas.microsoft.com/office/word/2018/wordml/cex" xmlns:w16cid="http://schemas.microsoft.com/office/word/2016/wordml/cid" xmlns:w16="http://schemas.microsoft.com/office/word/2018/wordml" xmlns:w16sdtdh="http://schemas.microsoft.com/office/word/2020/wordml/sdtdatahash" xmlns:w16se="http://schemas.microsoft.com/office/word/2015/wordml/symex" xmlns:wpg="http://schemas.microsoft.com/office/word/2010/wordprocessingGroup" xmlns:wpi="http://schemas.microsoft.com/office/word/2010/wordprocessingInk" xmlns:wne="http://schemas.microsoft.com/office/word/2006/wordml" xmlns:wps="http://schemas.microsoft.com/office/word/2010/wordprocessingShape" mc:Ignorable="w14 w15 w16se w16cid w16 w16cex w16sdtdh wp14">
+<w:document xmlns:wpc="http://schemas.microsoft.com/office/word/2010/wordprocessingCanvas" xmlns:cx="http://schemas.microsoft.com/office/drawing/2014/chartex" xmlns:cx1="http://schemas.microsoft.com/office/drawing/2015/9/8/chartex" xmlns:cx2="http://schemas.microsoft.com/office/drawing/2015/10/21/chartex" xmlns:cx3="http://schemas.microsoft.com/office/drawing/2016/5/9/chartex" xmlns:cx4="http://schemas.microsoft.com/office/drawing/2016/5/10/chartex" xmlns:cx5="http://schemas.microsoft.com/office/drawing/2016/5/11/chartex" xmlns:cx6="http://schemas.microsoft.com/office/drawing/2016/5/12/chartex" xmlns:cx7="http://schemas.microsoft.com/office/drawing/2016/5/13/chartex" xmlns:cx8="http://schemas.microsoft.com/office/drawing/2016/5/14/chartex" xmlns:mc="http://schemas.openxmlformats.org/markup-compatibility/2006" xmlns:aink="http://schemas.microsoft.com/office/drawing/2016/ink" xmlns:am3d="http://schemas.microsoft.com/office/drawing/2017/model3d" xmlns:o="urn:schemas-microsoft-com:office:office" xmlns:r="http://schemas.openxmlformats.org/officeDocument/2006/relationships" xmlns:m="http://schemas.openxmlformats.org/officeDocument/2006/math" xmlns:v="urn:schemas-microsoft-com:vml" xmlns:wp14="http://schemas.microsoft.com/office/word/2010/wordprocessingDrawing" xmlns:wp="http://schemas.openxmlformats.org/drawingml/2006/wordprocessingDrawing" xmlns:w10="urn:schemas-microsoft-com:office:word" xmlns:w="http://schemas.openxmlformats.org/wordprocessingml/2006/main" xmlns:w14="http://schemas.microsoft.com/office/word/2010/wordml" xmlns:w15="http://schemas.microsoft.com/office/word/2012/wordml" xmlns:w16cex="http://schemas.microsoft.com/office/word/2018/wordml/cex" xmlns:w16cid="http://schemas.microsoft.com/office/word/2016/wordml/cid" xmlns:w16="http://schemas.microsoft.com/office/word/2018/wordml" xmlns:w16se="http://schemas.microsoft.com/office/word/2015/wordml/symex" xmlns:wpg="http://schemas.microsoft.com/office/word/2010/wordprocessingGroup" xmlns:wpi="http://schemas.microsoft.com/office/word/2010/wordprocessingInk" xmlns:wne="http://schemas.microsoft.com/office/word/2006/wordml" xmlns:wps="http://schemas.microsoft.com/office/word/2010/wordprocessingShape" mc:Ignorable="w14 w15 w16se w16cid w16 w16cex wp14">
   <w:body>
     <w:p>
       <w:pPr>
@@ -2185,6 +2185,7 @@
           <w:b/>
           <w:bCs/>
           <w:color w:val="002060"/>
+          <w:highlight w:val="lightGray"/>
         </w:rPr>
         <w:t>si</w:t>
       </w:r>
@@ -2195,6 +2196,7 @@
           <w:bCs/>
           <w:color w:val="002060"/>
           <w:spacing w:val="10"/>
+          <w:highlight w:val="lightGray"/>
         </w:rPr>
         <w:t xml:space="preserve"> </w:t>
       </w:r>
@@ -2203,6 +2205,7 @@
           <w:b/>
           <w:bCs/>
           <w:color w:val="002060"/>
+          <w:highlight w:val="lightGray"/>
         </w:rPr>
         <w:t>en</w:t>
       </w:r>
@@ -2212,6 +2215,7 @@
           <w:bCs/>
           <w:color w:val="002060"/>
           <w:spacing w:val="10"/>
+          <w:highlight w:val="lightGray"/>
         </w:rPr>
         <w:t xml:space="preserve"> </w:t>
       </w:r>
@@ -2221,6 +2225,7 @@
           <w:b/>
           <w:bCs/>
           <w:color w:val="002060"/>
+          <w:highlight w:val="lightGray"/>
         </w:rPr>
         <w:t>la</w:t>
       </w:r>
@@ -2229,6 +2234,7 @@
           <w:b/>
           <w:bCs/>
           <w:color w:val="002060"/>
+          <w:highlight w:val="lightGray"/>
         </w:rPr>
         <w:pict w14:anchorId="1EAE8980">
           <v:shape id="_x0000_s1041" style="position:absolute;left:0;text-align:left;margin-left:88.35pt;margin-top:13.7pt;width:188.3pt;height:9.35pt;z-index:15730688;mso-position-horizontal-relative:page;mso-position-vertical-relative:text" coordorigin="1767,274" coordsize="3766,187" path="m5500,274r-3700,l1776,316r-9,51l1776,419r24,42l5500,461r25,-42l5533,367r-8,-51l5500,274xe" fillcolor="#a3e67b" stroked="f">
@@ -2243,6 +2249,7 @@
           <w:b/>
           <w:bCs/>
           <w:color w:val="002060"/>
+          <w:highlight w:val="lightGray"/>
         </w:rPr>
         <w:pict w14:anchorId="28DDC1A7">
           <v:shape id="_x0000_s1040" style="position:absolute;left:0;text-align:left;margin-left:377.5pt;margin-top:2.2pt;width:145.65pt;height:9.35pt;z-index:15731200;mso-position-horizontal-relative:page;mso-position-vertical-relative:text" coordorigin="7550,44" coordsize="2913,187" path="m10429,44r-2846,l7558,85r-8,52l7558,189r25,41l10429,230r25,-41l10462,137r-8,-52l10429,44xe" fillcolor="#a3e67b" stroked="f">
@@ -2257,6 +2264,7 @@
           <w:b/>
           <w:bCs/>
           <w:color w:val="002060"/>
+          <w:highlight w:val="lightGray"/>
         </w:rPr>
         <w:t>lista</w:t>
       </w:r>
@@ -2266,10 +2274,31 @@
           <w:b/>
           <w:bCs/>
           <w:color w:val="002060"/>
-        </w:rPr>
-        <w:t xml:space="preserve"> hay 10 jugadores, pero uno de ellos está en forma solidaria, otro jugador puede agregarse al partido y desplazar de la lista al solidario. En caso de que haya más de un jugador solidario, el que es desplazado es el primero que se agregó a la lista</w:t>
-      </w:r>
-      <w:r>
+          <w:highlight w:val="lightGray"/>
+        </w:rPr>
+        <w:t xml:space="preserve"> hay 10 jugadores, pero uno de ellos está en forma solidaria, otro jugador puede agregarse al partido y desplazar de la lista al solidario</w:t>
+      </w:r>
+      <w:r>
+        <w:rPr>
+          <w:b/>
+          <w:bCs/>
+          <w:color w:val="002060"/>
+        </w:rPr>
+        <w:t xml:space="preserve">. </w:t>
+      </w:r>
+      <w:r>
+        <w:rPr>
+          <w:b/>
+          <w:bCs/>
+          <w:color w:val="002060"/>
+          <w:highlight w:val="lightGray"/>
+        </w:rPr>
+        <w:t>En caso de que haya más de un jugador solidario, el que es desplazado es el primero que se agregó a la lista</w:t>
+      </w:r>
+      <w:r>
+        <w:rPr>
+          <w:highlight w:val="lightGray"/>
+        </w:rPr>
         <w:t>.</w:t>
       </w:r>
     </w:p>
@@ -2376,6 +2405,9 @@
         <w:jc w:val="both"/>
       </w:pPr>
       <w:r>
+        <w:rPr>
+          <w:highlight w:val="lightGray"/>
+        </w:rPr>
         <w:t>Los jugadores frecuentes tienen configurado una de las dos formas, mientras que los</w:t>
       </w:r>
     </w:p>
@@ -2387,6 +2419,9 @@
         <w:jc w:val="both"/>
       </w:pPr>
       <w:r>
+        <w:rPr>
+          <w:highlight w:val="lightGray"/>
+        </w:rPr>
         <w:pict w14:anchorId="2F63B62A">
           <v:shape id="_x0000_s1036" type="#_x0000_t202" style="position:absolute;left:0;text-align:left;margin-left:88.35pt;margin-top:2.2pt;width:188.75pt;height:9.35pt;z-index:-15910400;mso-position-horizontal-relative:page" fillcolor="#a3e67b" stroked="f">
             <v:fill opacity="26214f"/>
@@ -2418,6 +2453,9 @@
         </w:pict>
       </w:r>
       <w:r>
+        <w:rPr>
+          <w:highlight w:val="lightGray"/>
+        </w:rPr>
         <w:t xml:space="preserve">Por lo general </w:t>
       </w:r>
       <w:r>
@@ -2425,6 +2463,7 @@
           <w:b/>
           <w:bCs/>
           <w:color w:val="C00000"/>
+          <w:highlight w:val="lightGray"/>
         </w:rPr>
         <w:t>cambiar de un modo a otro siempre es posible</w:t>
       </w:r>
@@ -3852,7 +3891,7 @@
 </file>
 
 <file path=word/numbering.xml><?xml version="1.0" encoding="utf-8"?>
-<w:numbering xmlns:wpc="http://schemas.microsoft.com/office/word/2010/wordprocessingCanvas" xmlns:cx="http://schemas.microsoft.com/office/drawing/2014/chartex" xmlns:cx1="http://schemas.microsoft.com/office/drawing/2015/9/8/chartex" xmlns:cx2="http://schemas.microsoft.com/office/drawing/2015/10/21/chartex" xmlns:cx3="http://schemas.microsoft.com/office/drawing/2016/5/9/chartex" xmlns:cx4="http://schemas.microsoft.com/office/drawing/2016/5/10/chartex" xmlns:cx5="http://schemas.microsoft.com/office/drawing/2016/5/11/chartex" xmlns:cx6="http://schemas.microsoft.com/office/drawing/2016/5/12/chartex" xmlns:cx7="http://schemas.microsoft.com/office/drawing/2016/5/13/chartex" xmlns:cx8="http://schemas.microsoft.com/office/drawing/2016/5/14/chartex" xmlns:mc="http://schemas.openxmlformats.org/markup-compatibility/2006" xmlns:aink="http://schemas.microsoft.com/office/drawing/2016/ink" xmlns:am3d="http://schemas.microsoft.com/office/drawing/2017/model3d" xmlns:o="urn:schemas-microsoft-com:office:office" xmlns:r="http://schemas.openxmlformats.org/officeDocument/2006/relationships" xmlns:m="http://schemas.openxmlformats.org/officeDocument/2006/math" xmlns:v="urn:schemas-microsoft-com:vml" xmlns:wp14="http://schemas.microsoft.com/office/word/2010/wordprocessingDrawing" xmlns:wp="http://schemas.openxmlformats.org/drawingml/2006/wordprocessingDrawing" xmlns:w10="urn:schemas-microsoft-com:office:word" xmlns:w="http://schemas.openxmlformats.org/wordprocessingml/2006/main" xmlns:w14="http://schemas.microsoft.com/office/word/2010/wordml" xmlns:w15="http://schemas.microsoft.com/office/word/2012/wordml" xmlns:w16cex="http://schemas.microsoft.com/office/word/2018/wordml/cex" xmlns:w16cid="http://schemas.microsoft.com/office/word/2016/wordml/cid" xmlns:w16="http://schemas.microsoft.com/office/word/2018/wordml" xmlns:w16sdtdh="http://schemas.microsoft.com/office/word/2020/wordml/sdtdatahash" xmlns:w16se="http://schemas.microsoft.com/office/word/2015/wordml/symex" xmlns:wpg="http://schemas.microsoft.com/office/word/2010/wordprocessingGroup" xmlns:wpi="http://schemas.microsoft.com/office/word/2010/wordprocessingInk" xmlns:wne="http://schemas.microsoft.com/office/word/2006/wordml" xmlns:wps="http://schemas.microsoft.com/office/word/2010/wordprocessingShape" mc:Ignorable="w14 w15 w16se w16cid w16 w16cex w16sdtdh wp14">
+<w:numbering xmlns:wpc="http://schemas.microsoft.com/office/word/2010/wordprocessingCanvas" xmlns:cx="http://schemas.microsoft.com/office/drawing/2014/chartex" xmlns:cx1="http://schemas.microsoft.com/office/drawing/2015/9/8/chartex" xmlns:cx2="http://schemas.microsoft.com/office/drawing/2015/10/21/chartex" xmlns:cx3="http://schemas.microsoft.com/office/drawing/2016/5/9/chartex" xmlns:cx4="http://schemas.microsoft.com/office/drawing/2016/5/10/chartex" xmlns:cx5="http://schemas.microsoft.com/office/drawing/2016/5/11/chartex" xmlns:cx6="http://schemas.microsoft.com/office/drawing/2016/5/12/chartex" xmlns:cx7="http://schemas.microsoft.com/office/drawing/2016/5/13/chartex" xmlns:cx8="http://schemas.microsoft.com/office/drawing/2016/5/14/chartex" xmlns:mc="http://schemas.openxmlformats.org/markup-compatibility/2006" xmlns:aink="http://schemas.microsoft.com/office/drawing/2016/ink" xmlns:am3d="http://schemas.microsoft.com/office/drawing/2017/model3d" xmlns:o="urn:schemas-microsoft-com:office:office" xmlns:r="http://schemas.openxmlformats.org/officeDocument/2006/relationships" xmlns:m="http://schemas.openxmlformats.org/officeDocument/2006/math" xmlns:v="urn:schemas-microsoft-com:vml" xmlns:wp14="http://schemas.microsoft.com/office/word/2010/wordprocessingDrawing" xmlns:wp="http://schemas.openxmlformats.org/drawingml/2006/wordprocessingDrawing" xmlns:w10="urn:schemas-microsoft-com:office:word" xmlns:w="http://schemas.openxmlformats.org/wordprocessingml/2006/main" xmlns:w14="http://schemas.microsoft.com/office/word/2010/wordml" xmlns:w15="http://schemas.microsoft.com/office/word/2012/wordml" xmlns:w16cex="http://schemas.microsoft.com/office/word/2018/wordml/cex" xmlns:w16cid="http://schemas.microsoft.com/office/word/2016/wordml/cid" xmlns:w16="http://schemas.microsoft.com/office/word/2018/wordml" xmlns:w16se="http://schemas.microsoft.com/office/word/2015/wordml/symex" xmlns:wpg="http://schemas.microsoft.com/office/word/2010/wordprocessingGroup" xmlns:wpi="http://schemas.microsoft.com/office/word/2010/wordprocessingInk" xmlns:wne="http://schemas.microsoft.com/office/word/2006/wordml" xmlns:wps="http://schemas.microsoft.com/office/word/2010/wordprocessingShape" mc:Ignorable="w14 w15 w16se w16cid w16 w16cex wp14">
   <w:abstractNum w:abstractNumId="0" w15:restartNumberingAfterBreak="0">
     <w:nsid w:val="72E34A49"/>
     <w:multiLevelType w:val="hybridMultilevel"/>
@@ -3976,7 +4015,7 @@
 </file>
 
 <file path=word/styles.xml><?xml version="1.0" encoding="utf-8"?>
-<w:styles xmlns:mc="http://schemas.openxmlformats.org/markup-compatibility/2006" xmlns:r="http://schemas.openxmlformats.org/officeDocument/2006/relationships" xmlns:w="http://schemas.openxmlformats.org/wordprocessingml/2006/main" xmlns:w14="http://schemas.microsoft.com/office/word/2010/wordml" xmlns:w15="http://schemas.microsoft.com/office/word/2012/wordml" xmlns:w16cex="http://schemas.microsoft.com/office/word/2018/wordml/cex" xmlns:w16cid="http://schemas.microsoft.com/office/word/2016/wordml/cid" xmlns:w16="http://schemas.microsoft.com/office/word/2018/wordml" xmlns:w16sdtdh="http://schemas.microsoft.com/office/word/2020/wordml/sdtdatahash" xmlns:w16se="http://schemas.microsoft.com/office/word/2015/wordml/symex" mc:Ignorable="w14 w15 w16se w16cid w16 w16cex w16sdtdh">
+<w:styles xmlns:mc="http://schemas.openxmlformats.org/markup-compatibility/2006" xmlns:r="http://schemas.openxmlformats.org/officeDocument/2006/relationships" xmlns:w="http://schemas.openxmlformats.org/wordprocessingml/2006/main" xmlns:w14="http://schemas.microsoft.com/office/word/2010/wordml" xmlns:w15="http://schemas.microsoft.com/office/word/2012/wordml" xmlns:w16cex="http://schemas.microsoft.com/office/word/2018/wordml/cex" xmlns:w16cid="http://schemas.microsoft.com/office/word/2016/wordml/cid" xmlns:w16="http://schemas.microsoft.com/office/word/2018/wordml" xmlns:w16se="http://schemas.microsoft.com/office/word/2015/wordml/symex" mc:Ignorable="w14 w15 w16se w16cid w16 w16cex">
   <w:docDefaults>
     <w:rPrDefault>
       <w:rPr>

</xml_diff>

<commit_message>
se hace el crud a nivel de codigo de java para las tablas de los equipos y correcion de errores al agregar
</commit_message>
<xml_diff>
--- a/Descripcion/partido-convertido.docx
+++ b/Descripcion/partido-convertido.docx
@@ -1,6 +1,6 @@
 
 <file path=word/document.xml><?xml version="1.0" encoding="utf-8"?>
-<w:document xmlns:wpc="http://schemas.microsoft.com/office/word/2010/wordprocessingCanvas" xmlns:cx="http://schemas.microsoft.com/office/drawing/2014/chartex" xmlns:cx1="http://schemas.microsoft.com/office/drawing/2015/9/8/chartex" xmlns:cx2="http://schemas.microsoft.com/office/drawing/2015/10/21/chartex" xmlns:cx3="http://schemas.microsoft.com/office/drawing/2016/5/9/chartex" xmlns:cx4="http://schemas.microsoft.com/office/drawing/2016/5/10/chartex" xmlns:cx5="http://schemas.microsoft.com/office/drawing/2016/5/11/chartex" xmlns:cx6="http://schemas.microsoft.com/office/drawing/2016/5/12/chartex" xmlns:cx7="http://schemas.microsoft.com/office/drawing/2016/5/13/chartex" xmlns:cx8="http://schemas.microsoft.com/office/drawing/2016/5/14/chartex" xmlns:mc="http://schemas.openxmlformats.org/markup-compatibility/2006" xmlns:aink="http://schemas.microsoft.com/office/drawing/2016/ink" xmlns:am3d="http://schemas.microsoft.com/office/drawing/2017/model3d" xmlns:o="urn:schemas-microsoft-com:office:office" xmlns:r="http://schemas.openxmlformats.org/officeDocument/2006/relationships" xmlns:m="http://schemas.openxmlformats.org/officeDocument/2006/math" xmlns:v="urn:schemas-microsoft-com:vml" xmlns:wp14="http://schemas.microsoft.com/office/word/2010/wordprocessingDrawing" xmlns:wp="http://schemas.openxmlformats.org/drawingml/2006/wordprocessingDrawing" xmlns:w10="urn:schemas-microsoft-com:office:word" xmlns:w="http://schemas.openxmlformats.org/wordprocessingml/2006/main" xmlns:w14="http://schemas.microsoft.com/office/word/2010/wordml" xmlns:w15="http://schemas.microsoft.com/office/word/2012/wordml" xmlns:w16cex="http://schemas.microsoft.com/office/word/2018/wordml/cex" xmlns:w16cid="http://schemas.microsoft.com/office/word/2016/wordml/cid" xmlns:w16="http://schemas.microsoft.com/office/word/2018/wordml" xmlns:w16se="http://schemas.microsoft.com/office/word/2015/wordml/symex" xmlns:wpg="http://schemas.microsoft.com/office/word/2010/wordprocessingGroup" xmlns:wpi="http://schemas.microsoft.com/office/word/2010/wordprocessingInk" xmlns:wne="http://schemas.microsoft.com/office/word/2006/wordml" xmlns:wps="http://schemas.microsoft.com/office/word/2010/wordprocessingShape" mc:Ignorable="w14 w15 w16se w16cid w16 w16cex wp14">
+<w:document xmlns:wpc="http://schemas.microsoft.com/office/word/2010/wordprocessingCanvas" xmlns:cx="http://schemas.microsoft.com/office/drawing/2014/chartex" xmlns:cx1="http://schemas.microsoft.com/office/drawing/2015/9/8/chartex" xmlns:cx2="http://schemas.microsoft.com/office/drawing/2015/10/21/chartex" xmlns:cx3="http://schemas.microsoft.com/office/drawing/2016/5/9/chartex" xmlns:cx4="http://schemas.microsoft.com/office/drawing/2016/5/10/chartex" xmlns:cx5="http://schemas.microsoft.com/office/drawing/2016/5/11/chartex" xmlns:cx6="http://schemas.microsoft.com/office/drawing/2016/5/12/chartex" xmlns:cx7="http://schemas.microsoft.com/office/drawing/2016/5/13/chartex" xmlns:cx8="http://schemas.microsoft.com/office/drawing/2016/5/14/chartex" xmlns:mc="http://schemas.openxmlformats.org/markup-compatibility/2006" xmlns:aink="http://schemas.microsoft.com/office/drawing/2016/ink" xmlns:am3d="http://schemas.microsoft.com/office/drawing/2017/model3d" xmlns:o="urn:schemas-microsoft-com:office:office" xmlns:r="http://schemas.openxmlformats.org/officeDocument/2006/relationships" xmlns:m="http://schemas.openxmlformats.org/officeDocument/2006/math" xmlns:v="urn:schemas-microsoft-com:vml" xmlns:wp14="http://schemas.microsoft.com/office/word/2010/wordprocessingDrawing" xmlns:wp="http://schemas.openxmlformats.org/drawingml/2006/wordprocessingDrawing" xmlns:w10="urn:schemas-microsoft-com:office:word" xmlns:w="http://schemas.openxmlformats.org/wordprocessingml/2006/main" xmlns:w14="http://schemas.microsoft.com/office/word/2010/wordml" xmlns:w15="http://schemas.microsoft.com/office/word/2012/wordml" xmlns:w16cex="http://schemas.microsoft.com/office/word/2018/wordml/cex" xmlns:w16cid="http://schemas.microsoft.com/office/word/2016/wordml/cid" xmlns:w16="http://schemas.microsoft.com/office/word/2018/wordml" xmlns:w16sdtdh="http://schemas.microsoft.com/office/word/2020/wordml/sdtdatahash" xmlns:w16se="http://schemas.microsoft.com/office/word/2015/wordml/symex" xmlns:wpg="http://schemas.microsoft.com/office/word/2010/wordprocessingGroup" xmlns:wpi="http://schemas.microsoft.com/office/word/2010/wordprocessingInk" xmlns:wne="http://schemas.microsoft.com/office/word/2006/wordml" xmlns:wps="http://schemas.microsoft.com/office/word/2010/wordprocessingShape" mc:Ignorable="w14 w15 w16se w16cid w16 w16cex w16sdtdh wp14">
   <w:body>
     <w:p>
       <w:pPr>
@@ -583,6 +583,7 @@
                         <w:r>
                           <w:rPr>
                             <w:sz w:val="20"/>
+                            <w:highlight w:val="darkBlue"/>
                           </w:rPr>
                           <w:t>Crear partido</w:t>
                         </w:r>
@@ -651,11 +652,13 @@
                           <w:ind w:left="37"/>
                           <w:rPr>
                             <w:sz w:val="20"/>
+                            <w:highlight w:val="blue"/>
                           </w:rPr>
                         </w:pPr>
                         <w:r>
                           <w:rPr>
                             <w:sz w:val="20"/>
+                            <w:highlight w:val="blue"/>
                           </w:rPr>
                           <w:t>Agregar jugadores /</w:t>
                         </w:r>
@@ -676,6 +679,7 @@
                           <w:rPr>
                             <w:rFonts w:ascii="Times New Roman"/>
                             <w:sz w:val="16"/>
+                            <w:highlight w:val="blue"/>
                           </w:rPr>
                         </w:pPr>
                       </w:p>
@@ -836,11 +840,13 @@
                           <w:ind w:left="37"/>
                           <w:rPr>
                             <w:sz w:val="20"/>
+                            <w:highlight w:val="darkBlue"/>
                           </w:rPr>
                         </w:pPr>
                         <w:r>
                           <w:rPr>
                             <w:sz w:val="20"/>
+                            <w:highlight w:val="darkBlue"/>
                           </w:rPr>
                           <w:t xml:space="preserve">/ Bajarse de un </w:t>
                         </w:r>
@@ -848,6 +854,7 @@
                         <w:r>
                           <w:rPr>
                             <w:sz w:val="20"/>
+                            <w:highlight w:val="darkBlue"/>
                           </w:rPr>
                           <w:t>part</w:t>
                         </w:r>
@@ -872,11 +879,13 @@
                           <w:ind w:left="20"/>
                           <w:rPr>
                             <w:sz w:val="20"/>
+                            <w:highlight w:val="darkBlue"/>
                           </w:rPr>
                         </w:pPr>
                         <w:r>
                           <w:rPr>
                             <w:sz w:val="20"/>
+                            <w:highlight w:val="darkBlue"/>
                           </w:rPr>
                           <w:t>do /</w:t>
                         </w:r>
@@ -898,6 +907,7 @@
                           <w:rPr>
                             <w:rFonts w:ascii="Times New Roman"/>
                             <w:sz w:val="12"/>
+                            <w:highlight w:val="darkBlue"/>
                           </w:rPr>
                         </w:pPr>
                       </w:p>
@@ -939,6 +949,7 @@
                           <w:rPr>
                             <w:rFonts w:ascii="Times New Roman"/>
                             <w:sz w:val="12"/>
+                            <w:highlight w:val="darkBlue"/>
                           </w:rPr>
                         </w:pPr>
                       </w:p>
@@ -961,11 +972,13 @@
                           <w:ind w:left="37"/>
                           <w:rPr>
                             <w:sz w:val="20"/>
+                            <w:highlight w:val="darkBlue"/>
                           </w:rPr>
                         </w:pPr>
                         <w:r>
                           <w:rPr>
                             <w:sz w:val="20"/>
+                            <w:highlight w:val="darkBlue"/>
                           </w:rPr>
                           <w:t>Registrar ausencia</w:t>
                         </w:r>
@@ -986,6 +999,7 @@
                           <w:rPr>
                             <w:rFonts w:ascii="Times New Roman"/>
                             <w:sz w:val="12"/>
+                            <w:highlight w:val="darkBlue"/>
                           </w:rPr>
                         </w:pPr>
                       </w:p>
@@ -1029,6 +1043,7 @@
                         <w:r>
                           <w:rPr>
                             <w:sz w:val="20"/>
+                            <w:highlight w:val="darkBlue"/>
                           </w:rPr>
                           <w:t>Generar equipos</w:t>
                         </w:r>
@@ -3891,7 +3906,7 @@
 </file>
 
 <file path=word/numbering.xml><?xml version="1.0" encoding="utf-8"?>
-<w:numbering xmlns:wpc="http://schemas.microsoft.com/office/word/2010/wordprocessingCanvas" xmlns:cx="http://schemas.microsoft.com/office/drawing/2014/chartex" xmlns:cx1="http://schemas.microsoft.com/office/drawing/2015/9/8/chartex" xmlns:cx2="http://schemas.microsoft.com/office/drawing/2015/10/21/chartex" xmlns:cx3="http://schemas.microsoft.com/office/drawing/2016/5/9/chartex" xmlns:cx4="http://schemas.microsoft.com/office/drawing/2016/5/10/chartex" xmlns:cx5="http://schemas.microsoft.com/office/drawing/2016/5/11/chartex" xmlns:cx6="http://schemas.microsoft.com/office/drawing/2016/5/12/chartex" xmlns:cx7="http://schemas.microsoft.com/office/drawing/2016/5/13/chartex" xmlns:cx8="http://schemas.microsoft.com/office/drawing/2016/5/14/chartex" xmlns:mc="http://schemas.openxmlformats.org/markup-compatibility/2006" xmlns:aink="http://schemas.microsoft.com/office/drawing/2016/ink" xmlns:am3d="http://schemas.microsoft.com/office/drawing/2017/model3d" xmlns:o="urn:schemas-microsoft-com:office:office" xmlns:r="http://schemas.openxmlformats.org/officeDocument/2006/relationships" xmlns:m="http://schemas.openxmlformats.org/officeDocument/2006/math" xmlns:v="urn:schemas-microsoft-com:vml" xmlns:wp14="http://schemas.microsoft.com/office/word/2010/wordprocessingDrawing" xmlns:wp="http://schemas.openxmlformats.org/drawingml/2006/wordprocessingDrawing" xmlns:w10="urn:schemas-microsoft-com:office:word" xmlns:w="http://schemas.openxmlformats.org/wordprocessingml/2006/main" xmlns:w14="http://schemas.microsoft.com/office/word/2010/wordml" xmlns:w15="http://schemas.microsoft.com/office/word/2012/wordml" xmlns:w16cex="http://schemas.microsoft.com/office/word/2018/wordml/cex" xmlns:w16cid="http://schemas.microsoft.com/office/word/2016/wordml/cid" xmlns:w16="http://schemas.microsoft.com/office/word/2018/wordml" xmlns:w16se="http://schemas.microsoft.com/office/word/2015/wordml/symex" xmlns:wpg="http://schemas.microsoft.com/office/word/2010/wordprocessingGroup" xmlns:wpi="http://schemas.microsoft.com/office/word/2010/wordprocessingInk" xmlns:wne="http://schemas.microsoft.com/office/word/2006/wordml" xmlns:wps="http://schemas.microsoft.com/office/word/2010/wordprocessingShape" mc:Ignorable="w14 w15 w16se w16cid w16 w16cex wp14">
+<w:numbering xmlns:wpc="http://schemas.microsoft.com/office/word/2010/wordprocessingCanvas" xmlns:cx="http://schemas.microsoft.com/office/drawing/2014/chartex" xmlns:cx1="http://schemas.microsoft.com/office/drawing/2015/9/8/chartex" xmlns:cx2="http://schemas.microsoft.com/office/drawing/2015/10/21/chartex" xmlns:cx3="http://schemas.microsoft.com/office/drawing/2016/5/9/chartex" xmlns:cx4="http://schemas.microsoft.com/office/drawing/2016/5/10/chartex" xmlns:cx5="http://schemas.microsoft.com/office/drawing/2016/5/11/chartex" xmlns:cx6="http://schemas.microsoft.com/office/drawing/2016/5/12/chartex" xmlns:cx7="http://schemas.microsoft.com/office/drawing/2016/5/13/chartex" xmlns:cx8="http://schemas.microsoft.com/office/drawing/2016/5/14/chartex" xmlns:mc="http://schemas.openxmlformats.org/markup-compatibility/2006" xmlns:aink="http://schemas.microsoft.com/office/drawing/2016/ink" xmlns:am3d="http://schemas.microsoft.com/office/drawing/2017/model3d" xmlns:o="urn:schemas-microsoft-com:office:office" xmlns:r="http://schemas.openxmlformats.org/officeDocument/2006/relationships" xmlns:m="http://schemas.openxmlformats.org/officeDocument/2006/math" xmlns:v="urn:schemas-microsoft-com:vml" xmlns:wp14="http://schemas.microsoft.com/office/word/2010/wordprocessingDrawing" xmlns:wp="http://schemas.openxmlformats.org/drawingml/2006/wordprocessingDrawing" xmlns:w10="urn:schemas-microsoft-com:office:word" xmlns:w="http://schemas.openxmlformats.org/wordprocessingml/2006/main" xmlns:w14="http://schemas.microsoft.com/office/word/2010/wordml" xmlns:w15="http://schemas.microsoft.com/office/word/2012/wordml" xmlns:w16cex="http://schemas.microsoft.com/office/word/2018/wordml/cex" xmlns:w16cid="http://schemas.microsoft.com/office/word/2016/wordml/cid" xmlns:w16="http://schemas.microsoft.com/office/word/2018/wordml" xmlns:w16sdtdh="http://schemas.microsoft.com/office/word/2020/wordml/sdtdatahash" xmlns:w16se="http://schemas.microsoft.com/office/word/2015/wordml/symex" xmlns:wpg="http://schemas.microsoft.com/office/word/2010/wordprocessingGroup" xmlns:wpi="http://schemas.microsoft.com/office/word/2010/wordprocessingInk" xmlns:wne="http://schemas.microsoft.com/office/word/2006/wordml" xmlns:wps="http://schemas.microsoft.com/office/word/2010/wordprocessingShape" mc:Ignorable="w14 w15 w16se w16cid w16 w16cex w16sdtdh wp14">
   <w:abstractNum w:abstractNumId="0" w15:restartNumberingAfterBreak="0">
     <w:nsid w:val="72E34A49"/>
     <w:multiLevelType w:val="hybridMultilevel"/>
@@ -4015,7 +4030,7 @@
 </file>
 
 <file path=word/styles.xml><?xml version="1.0" encoding="utf-8"?>
-<w:styles xmlns:mc="http://schemas.openxmlformats.org/markup-compatibility/2006" xmlns:r="http://schemas.openxmlformats.org/officeDocument/2006/relationships" xmlns:w="http://schemas.openxmlformats.org/wordprocessingml/2006/main" xmlns:w14="http://schemas.microsoft.com/office/word/2010/wordml" xmlns:w15="http://schemas.microsoft.com/office/word/2012/wordml" xmlns:w16cex="http://schemas.microsoft.com/office/word/2018/wordml/cex" xmlns:w16cid="http://schemas.microsoft.com/office/word/2016/wordml/cid" xmlns:w16="http://schemas.microsoft.com/office/word/2018/wordml" xmlns:w16se="http://schemas.microsoft.com/office/word/2015/wordml/symex" mc:Ignorable="w14 w15 w16se w16cid w16 w16cex">
+<w:styles xmlns:mc="http://schemas.openxmlformats.org/markup-compatibility/2006" xmlns:r="http://schemas.openxmlformats.org/officeDocument/2006/relationships" xmlns:w="http://schemas.openxmlformats.org/wordprocessingml/2006/main" xmlns:w14="http://schemas.microsoft.com/office/word/2010/wordml" xmlns:w15="http://schemas.microsoft.com/office/word/2012/wordml" xmlns:w16cex="http://schemas.microsoft.com/office/word/2018/wordml/cex" xmlns:w16cid="http://schemas.microsoft.com/office/word/2016/wordml/cid" xmlns:w16="http://schemas.microsoft.com/office/word/2018/wordml" xmlns:w16sdtdh="http://schemas.microsoft.com/office/word/2020/wordml/sdtdatahash" xmlns:w16se="http://schemas.microsoft.com/office/word/2015/wordml/symex" mc:Ignorable="w14 w15 w16se w16cid w16 w16cex w16sdtdh">
   <w:docDefaults>
     <w:rPrDefault>
       <w:rPr>

</xml_diff>